<commit_message>
feat: add valuation watcher with audit logs; update model trace HITL
- 盯: right-panel read-only watcher on the latest analysis-state.json (sensitivities, falsifiers, valuations)
- 盯: rule scan (westock + AnySearch) + LLM gate, daily deep check, silent by default
- 盯: finding cards with source links, chat, expandable focus points
- 盯: per-run audit logs (sources, candidates, tool calls, judgment) in the UI and /api/watch/:id/logs
- 盯: read-only agent sessions scoped to .watch/
- model trace: HITL proposal/confirm flow, updated docs and UI shots
- tests: test:watch (59), test:p1 (189), trace/dashboard E2E
</commit_message>
<xml_diff>
--- a/docs/模型追踪-功能实现与使用说明.docx
+++ b/docs/模型追踪-功能实现与使用说明.docx
@@ -1211,6 +1211,42 @@
           <w:sz w:val="17"/>
         </w:rPr>
         <w:t>图 1  追踪面板与判断卡</w:t>
+      </w:r>
+    </w:p>
+    <w:p>
+      <w:pPr>
+        <w:keepLines/>
+        <w:spacing w:line="348" w:lineRule="auto" w:after="100"/>
+      </w:pPr>
+      <w:r>
+        <w:rPr>
+          <w:rFonts w:ascii="Helvetica Neue" w:hAnsi="Helvetica Neue" w:eastAsia="Hiragino Sans GB"/>
+          <w:b w:val="0"/>
+          <w:i w:val="0"/>
+          <w:color w:val="262624"/>
+          <w:sz w:val="21"/>
+        </w:rPr>
+        <w:t>左边是对话，右边是追踪。</w:t>
+      </w:r>
+      <w:r>
+        <w:rPr>
+          <w:rFonts w:ascii="Helvetica Neue" w:hAnsi="Helvetica Neue" w:eastAsia="Hiragino Sans GB"/>
+          <w:b/>
+          <w:i w:val="0"/>
+          <w:color w:val="262624"/>
+          <w:sz w:val="21"/>
+        </w:rPr>
+        <w:t>判断卡不在右栏，也不是弹窗</w:t>
+      </w:r>
+      <w:r>
+        <w:rPr>
+          <w:rFonts w:ascii="Helvetica Neue" w:hAnsi="Helvetica Neue" w:eastAsia="Hiragino Sans GB"/>
+          <w:b w:val="0"/>
+          <w:i w:val="0"/>
+          <w:color w:val="262624"/>
+          <w:sz w:val="21"/>
+        </w:rPr>
+        <w:t>：它出现在对话里，紧跟 Workbench 的上一次回答（图中最后一块），往下滚就是聊天记录，不会遮住内容。</w:t>
       </w:r>
     </w:p>
     <w:p>
@@ -2887,6 +2923,42 @@
     </w:p>
     <w:p>
       <w:pPr>
+        <w:keepLines/>
+        <w:spacing w:line="348" w:lineRule="auto" w:after="100"/>
+      </w:pPr>
+      <w:r>
+        <w:rPr>
+          <w:rFonts w:ascii="Helvetica Neue" w:hAnsi="Helvetica Neue" w:eastAsia="Hiragino Sans GB"/>
+          <w:b w:val="0"/>
+          <w:i w:val="0"/>
+          <w:color w:val="262624"/>
+          <w:sz w:val="21"/>
+        </w:rPr>
+        <w:t>判断卡不是弹窗：它</w:t>
+      </w:r>
+      <w:r>
+        <w:rPr>
+          <w:rFonts w:ascii="Helvetica Neue" w:hAnsi="Helvetica Neue" w:eastAsia="Hiragino Sans GB"/>
+          <w:b/>
+          <w:i w:val="0"/>
+          <w:color w:val="262624"/>
+          <w:sz w:val="21"/>
+        </w:rPr>
+        <w:t>跟在 Workbench 上一次回答后面</w:t>
+      </w:r>
+      <w:r>
+        <w:rPr>
+          <w:rFonts w:ascii="Helvetica Neue" w:hAnsi="Helvetica Neue" w:eastAsia="Hiragino Sans GB"/>
+          <w:b w:val="0"/>
+          <w:i w:val="0"/>
+          <w:color w:val="262624"/>
+          <w:sz w:val="21"/>
+        </w:rPr>
+        <w:t>，和对话一起滚动。卡里先给出这次判断对应的数字，再给三个选项。</w:t>
+      </w:r>
+    </w:p>
+    <w:p>
+      <w:pPr>
         <w:keepNext/>
         <w:spacing w:before="240" w:after="80"/>
       </w:pPr>
@@ -2898,7 +2970,437 @@
           <w:color w:val="1B1B19"/>
           <w:sz w:val="24"/>
         </w:rPr>
-        <w:t>4.1 三个选项</w:t>
+        <w:t>4.1 先看卡片里的数字</w:t>
+      </w:r>
+    </w:p>
+    <w:tbl>
+      <w:tblPr>
+        <w:jc w:val="center"/>
+        <w:tblLook w:firstColumn="1" w:firstRow="1" w:lastColumn="0" w:lastRow="0" w:noHBand="0" w:noVBand="1" w:val="04A0"/>
+        <w:tblLayout w:type="fixed"/>
+        <w:tblW w:w="9412" w:type="dxa"/>
+        <w:tblBorders>
+          <w:top w:val="single" w:sz="4" w:space="0" w:color="D8D2C3"/>
+          <w:left w:val="single" w:sz="4" w:space="0" w:color="D8D2C3"/>
+          <w:bottom w:val="single" w:sz="4" w:space="0" w:color="D8D2C3"/>
+          <w:right w:val="single" w:sz="4" w:space="0" w:color="D8D2C3"/>
+          <w:insideH w:val="single" w:sz="4" w:space="0" w:color="D8D2C3"/>
+          <w:insideV w:val="single" w:sz="4" w:space="0" w:color="D8D2C3"/>
+        </w:tblBorders>
+      </w:tblPr>
+      <w:tblGrid>
+        <w:gridCol w:w="1793"/>
+        <w:gridCol w:w="7618"/>
+      </w:tblGrid>
+      <w:tr>
+        <w:trPr>
+          <w:cantSplit w:val="true"/>
+          <w:tblHeader w:val="true"/>
+        </w:trPr>
+        <w:tc>
+          <w:tcPr>
+            <w:tcW w:type="dxa" w:w="1793"/>
+            <w:vAlign w:val="center"/>
+            <w:tcMar>
+              <w:top w:w="55" w:type="dxa"/>
+              <w:bottom w:w="55" w:type="dxa"/>
+              <w:left w:w="80" w:type="dxa"/>
+              <w:right w:w="80" w:type="dxa"/>
+            </w:tcMar>
+            <w:shd w:val="clear" w:fill="1B1B19"/>
+          </w:tcPr>
+          <w:p>
+            <w:pPr>
+              <w:keepNext/>
+              <w:spacing w:after="0" w:line="300" w:lineRule="auto"/>
+            </w:pPr>
+            <w:r>
+              <w:rPr>
+                <w:rFonts w:ascii="Helvetica Neue" w:hAnsi="Helvetica Neue" w:eastAsia="Hiragino Sans GB"/>
+                <w:b/>
+                <w:i w:val="0"/>
+                <w:color w:val="FFFFFF"/>
+                <w:sz w:val="17"/>
+              </w:rPr>
+              <w:t>卡片上的位置</w:t>
+            </w:r>
+          </w:p>
+        </w:tc>
+        <w:tc>
+          <w:tcPr>
+            <w:tcW w:type="dxa" w:w="7618"/>
+            <w:vAlign w:val="center"/>
+            <w:tcMar>
+              <w:top w:w="55" w:type="dxa"/>
+              <w:bottom w:w="55" w:type="dxa"/>
+              <w:left w:w="80" w:type="dxa"/>
+              <w:right w:w="80" w:type="dxa"/>
+            </w:tcMar>
+            <w:shd w:val="clear" w:fill="1B1B19"/>
+          </w:tcPr>
+          <w:p>
+            <w:pPr>
+              <w:keepNext/>
+              <w:spacing w:after="0" w:line="300" w:lineRule="auto"/>
+            </w:pPr>
+            <w:r>
+              <w:rPr>
+                <w:rFonts w:ascii="Helvetica Neue" w:hAnsi="Helvetica Neue" w:eastAsia="Hiragino Sans GB"/>
+                <w:b/>
+                <w:i w:val="0"/>
+                <w:color w:val="FFFFFF"/>
+                <w:sz w:val="17"/>
+              </w:rPr>
+              <w:t>含义</w:t>
+            </w:r>
+          </w:p>
+        </w:tc>
+      </w:tr>
+      <w:tr>
+        <w:trPr>
+          <w:cantSplit w:val="true"/>
+        </w:trPr>
+        <w:tc>
+          <w:tcPr>
+            <w:tcW w:type="dxa" w:w="1793"/>
+            <w:vAlign w:val="center"/>
+            <w:tcMar>
+              <w:top w:w="55" w:type="dxa"/>
+              <w:bottom w:w="55" w:type="dxa"/>
+              <w:left w:w="80" w:type="dxa"/>
+              <w:right w:w="80" w:type="dxa"/>
+            </w:tcMar>
+          </w:tcPr>
+          <w:p>
+            <w:pPr>
+              <w:keepNext/>
+              <w:spacing w:after="0" w:line="300" w:lineRule="auto"/>
+            </w:pPr>
+            <w:r>
+              <w:rPr>
+                <w:rFonts w:ascii="Helvetica Neue" w:hAnsi="Helvetica Neue" w:eastAsia="Hiragino Sans GB"/>
+                <w:b/>
+                <w:i w:val="0"/>
+                <w:color w:val="262624"/>
+                <w:sz w:val="17"/>
+              </w:rPr>
+              <w:t>当前模型估值</w:t>
+            </w:r>
+          </w:p>
+        </w:tc>
+        <w:tc>
+          <w:tcPr>
+            <w:tcW w:type="dxa" w:w="7618"/>
+            <w:vAlign w:val="center"/>
+            <w:tcMar>
+              <w:top w:w="55" w:type="dxa"/>
+              <w:bottom w:w="55" w:type="dxa"/>
+              <w:left w:w="80" w:type="dxa"/>
+              <w:right w:w="80" w:type="dxa"/>
+            </w:tcMar>
+          </w:tcPr>
+          <w:p>
+            <w:pPr>
+              <w:keepNext/>
+              <w:spacing w:after="0" w:line="300" w:lineRule="auto"/>
+            </w:pPr>
+            <w:r>
+              <w:rPr>
+                <w:rFonts w:ascii="Helvetica Neue" w:hAnsi="Helvetica Neue" w:eastAsia="Hiragino Sans GB"/>
+                <w:b w:val="0"/>
+                <w:i w:val="0"/>
+                <w:color w:val="262624"/>
+                <w:sz w:val="17"/>
+              </w:rPr>
+              <w:t>已经生效的目标价（示例 ¥92 元/股）；提案未被采纳时，这个数字不会变</w:t>
+            </w:r>
+          </w:p>
+        </w:tc>
+      </w:tr>
+      <w:tr>
+        <w:trPr>
+          <w:cantSplit w:val="true"/>
+        </w:trPr>
+        <w:tc>
+          <w:tcPr>
+            <w:tcW w:type="dxa" w:w="1793"/>
+            <w:vAlign w:val="center"/>
+            <w:tcMar>
+              <w:top w:w="55" w:type="dxa"/>
+              <w:bottom w:w="55" w:type="dxa"/>
+              <w:left w:w="80" w:type="dxa"/>
+              <w:right w:w="80" w:type="dxa"/>
+            </w:tcMar>
+            <w:shd w:val="clear" w:fill="FAF8F3"/>
+          </w:tcPr>
+          <w:p>
+            <w:pPr>
+              <w:keepNext/>
+              <w:spacing w:after="0" w:line="300" w:lineRule="auto"/>
+            </w:pPr>
+            <w:r>
+              <w:rPr>
+                <w:rFonts w:ascii="Helvetica Neue" w:hAnsi="Helvetica Neue" w:eastAsia="Hiragino Sans GB"/>
+                <w:b w:val="0"/>
+                <w:i w:val="0"/>
+                <w:color w:val="262624"/>
+                <w:sz w:val="17"/>
+              </w:rPr>
+              <w:t>现价 / 空间</w:t>
+            </w:r>
+          </w:p>
+        </w:tc>
+        <w:tc>
+          <w:tcPr>
+            <w:tcW w:type="dxa" w:w="7618"/>
+            <w:vAlign w:val="center"/>
+            <w:tcMar>
+              <w:top w:w="55" w:type="dxa"/>
+              <w:bottom w:w="55" w:type="dxa"/>
+              <w:left w:w="80" w:type="dxa"/>
+              <w:right w:w="80" w:type="dxa"/>
+            </w:tcMar>
+            <w:shd w:val="clear" w:fill="FAF8F3"/>
+          </w:tcPr>
+          <w:p>
+            <w:pPr>
+              <w:keepNext/>
+              <w:spacing w:after="0" w:line="300" w:lineRule="auto"/>
+            </w:pPr>
+            <w:r>
+              <w:rPr>
+                <w:rFonts w:ascii="Helvetica Neue" w:hAnsi="Helvetica Neue" w:eastAsia="Hiragino Sans GB"/>
+                <w:b w:val="0"/>
+                <w:i w:val="0"/>
+                <w:color w:val="262624"/>
+                <w:sz w:val="17"/>
+              </w:rPr>
+              <w:t>现价是多少、目标价相对现价还有多少空间（示例 78 元、+17.9%）</w:t>
+            </w:r>
+          </w:p>
+        </w:tc>
+      </w:tr>
+      <w:tr>
+        <w:trPr>
+          <w:cantSplit w:val="true"/>
+        </w:trPr>
+        <w:tc>
+          <w:tcPr>
+            <w:tcW w:type="dxa" w:w="1793"/>
+            <w:vAlign w:val="center"/>
+            <w:tcMar>
+              <w:top w:w="55" w:type="dxa"/>
+              <w:bottom w:w="55" w:type="dxa"/>
+              <w:left w:w="80" w:type="dxa"/>
+              <w:right w:w="80" w:type="dxa"/>
+            </w:tcMar>
+          </w:tcPr>
+          <w:p>
+            <w:pPr>
+              <w:keepNext/>
+              <w:spacing w:after="0" w:line="300" w:lineRule="auto"/>
+            </w:pPr>
+            <w:r>
+              <w:rPr>
+                <w:rFonts w:ascii="Helvetica Neue" w:hAnsi="Helvetica Neue" w:eastAsia="Hiragino Sans GB"/>
+                <w:b w:val="0"/>
+                <w:i w:val="0"/>
+                <w:color w:val="262624"/>
+                <w:sz w:val="17"/>
+              </w:rPr>
+              <w:t>情景区间</w:t>
+            </w:r>
+          </w:p>
+        </w:tc>
+        <w:tc>
+          <w:tcPr>
+            <w:tcW w:type="dxa" w:w="7618"/>
+            <w:vAlign w:val="center"/>
+            <w:tcMar>
+              <w:top w:w="55" w:type="dxa"/>
+              <w:bottom w:w="55" w:type="dxa"/>
+              <w:left w:w="80" w:type="dxa"/>
+              <w:right w:w="80" w:type="dxa"/>
+            </w:tcMar>
+          </w:tcPr>
+          <w:p>
+            <w:pPr>
+              <w:keepNext/>
+              <w:spacing w:after="0" w:line="300" w:lineRule="auto"/>
+            </w:pPr>
+            <w:r>
+              <w:rPr>
+                <w:rFonts w:ascii="Helvetica Neue" w:hAnsi="Helvetica Neue" w:eastAsia="Hiragino Sans GB"/>
+                <w:b w:val="0"/>
+                <w:i w:val="0"/>
+                <w:color w:val="262624"/>
+                <w:sz w:val="17"/>
+              </w:rPr>
+              <w:t>悲观–乐观区间（示例 65–120），用来看目标价落在什么范围</w:t>
+            </w:r>
+          </w:p>
+        </w:tc>
+      </w:tr>
+      <w:tr>
+        <w:trPr>
+          <w:cantSplit w:val="true"/>
+        </w:trPr>
+        <w:tc>
+          <w:tcPr>
+            <w:tcW w:type="dxa" w:w="1793"/>
+            <w:vAlign w:val="center"/>
+            <w:tcMar>
+              <w:top w:w="55" w:type="dxa"/>
+              <w:bottom w:w="55" w:type="dxa"/>
+              <w:left w:w="80" w:type="dxa"/>
+              <w:right w:w="80" w:type="dxa"/>
+            </w:tcMar>
+            <w:shd w:val="clear" w:fill="FAF8F3"/>
+          </w:tcPr>
+          <w:p>
+            <w:pPr>
+              <w:keepNext/>
+              <w:spacing w:after="0" w:line="300" w:lineRule="auto"/>
+            </w:pPr>
+            <w:r>
+              <w:rPr>
+                <w:rFonts w:ascii="Helvetica Neue" w:hAnsi="Helvetica Neue" w:eastAsia="Hiragino Sans GB"/>
+                <w:b w:val="0"/>
+                <w:i w:val="0"/>
+                <w:color w:val="262624"/>
+                <w:sz w:val="17"/>
+              </w:rPr>
+              <w:t>估值日 / 评级</w:t>
+            </w:r>
+          </w:p>
+        </w:tc>
+        <w:tc>
+          <w:tcPr>
+            <w:tcW w:type="dxa" w:w="7618"/>
+            <w:vAlign w:val="center"/>
+            <w:tcMar>
+              <w:top w:w="55" w:type="dxa"/>
+              <w:bottom w:w="55" w:type="dxa"/>
+              <w:left w:w="80" w:type="dxa"/>
+              <w:right w:w="80" w:type="dxa"/>
+            </w:tcMar>
+            <w:shd w:val="clear" w:fill="FAF8F3"/>
+          </w:tcPr>
+          <w:p>
+            <w:pPr>
+              <w:keepNext/>
+              <w:spacing w:after="0" w:line="300" w:lineRule="auto"/>
+            </w:pPr>
+            <w:r>
+              <w:rPr>
+                <w:rFonts w:ascii="Helvetica Neue" w:hAnsi="Helvetica Neue" w:eastAsia="Hiragino Sans GB"/>
+                <w:b w:val="0"/>
+                <w:i w:val="0"/>
+                <w:color w:val="262624"/>
+                <w:sz w:val="17"/>
+              </w:rPr>
+              <w:t>这个数字的时点和评级（示例 2026-09-01、增持（下修））</w:t>
+            </w:r>
+          </w:p>
+        </w:tc>
+      </w:tr>
+      <w:tr>
+        <w:trPr>
+          <w:cantSplit w:val="true"/>
+        </w:trPr>
+        <w:tc>
+          <w:tcPr>
+            <w:tcW w:type="dxa" w:w="1793"/>
+            <w:vAlign w:val="center"/>
+            <w:tcMar>
+              <w:top w:w="55" w:type="dxa"/>
+              <w:bottom w:w="55" w:type="dxa"/>
+              <w:left w:w="80" w:type="dxa"/>
+              <w:right w:w="80" w:type="dxa"/>
+            </w:tcMar>
+          </w:tcPr>
+          <w:p>
+            <w:pPr>
+              <w:keepNext w:val="0"/>
+              <w:spacing w:after="0" w:line="300" w:lineRule="auto"/>
+            </w:pPr>
+            <w:r>
+              <w:rPr>
+                <w:rFonts w:ascii="Helvetica Neue" w:hAnsi="Helvetica Neue" w:eastAsia="Hiragino Sans GB"/>
+                <w:b w:val="0"/>
+                <w:i w:val="0"/>
+                <w:color w:val="262624"/>
+                <w:sz w:val="17"/>
+              </w:rPr>
+              <w:t>提案未写入主模型</w:t>
+            </w:r>
+          </w:p>
+        </w:tc>
+        <w:tc>
+          <w:tcPr>
+            <w:tcW w:type="dxa" w:w="7618"/>
+            <w:vAlign w:val="center"/>
+            <w:tcMar>
+              <w:top w:w="55" w:type="dxa"/>
+              <w:bottom w:w="55" w:type="dxa"/>
+              <w:left w:w="80" w:type="dxa"/>
+              <w:right w:w="80" w:type="dxa"/>
+            </w:tcMar>
+          </w:tcPr>
+          <w:p>
+            <w:pPr>
+              <w:keepNext w:val="0"/>
+              <w:spacing w:after="0" w:line="300" w:lineRule="auto"/>
+            </w:pPr>
+            <w:r>
+              <w:rPr>
+                <w:rFonts w:ascii="Helvetica Neue" w:hAnsi="Helvetica Neue" w:eastAsia="Hiragino Sans GB"/>
+                <w:b w:val="0"/>
+                <w:i w:val="0"/>
+                <w:color w:val="262624"/>
+                <w:sz w:val="17"/>
+              </w:rPr>
+              <w:t>这条是提案，主报告和模型还没有被改</w:t>
+            </w:r>
+          </w:p>
+        </w:tc>
+      </w:tr>
+    </w:tbl>
+    <w:p>
+      <w:pPr>
+        <w:spacing w:after="40"/>
+      </w:pPr>
+    </w:p>
+    <w:p>
+      <w:pPr>
+        <w:keepLines/>
+        <w:spacing w:line="348" w:lineRule="auto" w:after="100"/>
+      </w:pPr>
+      <w:r>
+        <w:rPr>
+          <w:rFonts w:ascii="Helvetica Neue" w:hAnsi="Helvetica Neue" w:eastAsia="Hiragino Sans GB"/>
+          <w:b w:val="0"/>
+          <w:i w:val="0"/>
+          <w:color w:val="262624"/>
+          <w:sz w:val="21"/>
+        </w:rPr>
+        <w:t>先有这个数字，再回答「偏高 / 合理 / 偏低」才有依据。</w:t>
+      </w:r>
+    </w:p>
+    <w:p>
+      <w:pPr>
+        <w:keepNext/>
+        <w:spacing w:before="240" w:after="80"/>
+      </w:pPr>
+      <w:r>
+        <w:rPr>
+          <w:rFonts w:ascii="Helvetica Neue" w:hAnsi="Helvetica Neue" w:eastAsia="Hiragino Sans GB"/>
+          <w:b/>
+          <w:i w:val="0"/>
+          <w:color w:val="1B1B19"/>
+          <w:sz w:val="24"/>
+        </w:rPr>
+        <w:t>4.2 三个选项</w:t>
       </w:r>
     </w:p>
     <w:tbl>
@@ -3413,7 +3915,7 @@
           <w:color w:val="1B1B19"/>
           <w:sz w:val="24"/>
         </w:rPr>
-        <w:t>4.2 判断前 30 秒检查清单</w:t>
+        <w:t>4.3 判断前 30 秒检查清单</w:t>
       </w:r>
     </w:p>
     <w:p>
@@ -3453,7 +3955,7 @@
           <w:color w:val="262624"/>
           <w:sz w:val="21"/>
         </w:rPr>
-        <w:t>：目标价、区间、评级有没有变？</w:t>
+        <w:t>：卡片上的目标价、区间、评级有没有变？</w:t>
       </w:r>
     </w:p>
     <w:p>
@@ -3605,7 +4107,7 @@
           <w:color w:val="1B1B19"/>
           <w:sz w:val="24"/>
         </w:rPr>
-        <w:t>4.3 判断之后会发生什么</w:t>
+        <w:t>4.4 判断之后会发生什么</w:t>
       </w:r>
     </w:p>
     <w:p>
@@ -3723,7 +4225,7 @@
           <w:color w:val="262624"/>
           <w:sz w:val="21"/>
         </w:rPr>
-        <w:t>。你可以借这一步再看一眼原因和文件。</w:t>
+        <w:t>。你可以借这一步再看一眼原因和文件（二次确认卡同样带数字）。</w:t>
       </w:r>
     </w:p>
     <w:p>
@@ -7127,7 +7629,7 @@
           <w:color w:val="262624"/>
           <w:sz w:val="21"/>
         </w:rPr>
-        <w:t>手机/窄屏下，判断卡纵向排列，右栏通过抽屉打开：</w:t>
+        <w:t>手机/窄屏下，判断卡同样跟在回答后面，只是改成单列：数字块上下排，三个选项竖着摆。右栏通过左上角抽屉打开：</w:t>
       </w:r>
     </w:p>
     <w:p>
@@ -7398,7 +7900,7 @@
           <w:color w:val="262624"/>
           <w:sz w:val="21"/>
         </w:rPr>
-        <w:t>如果都不满足，就不会弹卡。可以在右栏「追踪」里查看历史。</w:t>
+        <w:t>如果都不满足，对话里就不会出现判断卡。可以在右栏「追踪」里查看历史。</w:t>
       </w:r>
     </w:p>
     <w:p>
@@ -11202,7 +11704,7 @@
                 <w:color w:val="262624"/>
                 <w:sz w:val="17"/>
               </w:rPr>
-              <w:t>判断 / 采纳 / 确认</w:t>
+              <w:t>对话流内判断 / 采纳 / 确认（挂在最后一条消息之后）</w:t>
             </w:r>
           </w:p>
         </w:tc>

</xml_diff>